<commit_message>
Changes to Lab 2 Integration testing part class name
</commit_message>
<xml_diff>
--- a/Labs/EG 02-Unit testing Java.docx
+++ b/Labs/EG 02-Unit testing Java.docx
@@ -7431,12 +7431,12 @@
           <w:rFonts w:ascii="Consolas" w:hAnsi="Consolas" w:cs="Consolas"/>
           <w:b/>
           <w:bCs/>
-          <w:color w:val="000000"/>
-          <w:sz w:val="20"/>
-          <w:szCs w:val="20"/>
-          <w:lang w:eastAsia="en-US"/>
-        </w:rPr>
-        <w:t>UserService</w:t>
+          <w:color w:val="2B91AF"/>
+          <w:sz w:val="20"/>
+          <w:szCs w:val="20"/>
+          <w:lang w:eastAsia="en-US"/>
+        </w:rPr>
+        <w:t>CustomerApiIntegration</w:t>
       </w:r>
       <w:proofErr w:type="spellEnd"/>
       <w:r>
@@ -7444,7 +7444,7 @@
           <w:rFonts w:ascii="Consolas" w:hAnsi="Consolas" w:cs="Consolas"/>
           <w:b/>
           <w:bCs/>
-          <w:color w:val="000000"/>
+          <w:color w:val="2B91AF"/>
           <w:sz w:val="20"/>
           <w:szCs w:val="20"/>
           <w:lang w:eastAsia="en-US"/>
@@ -7462,7 +7462,7 @@
           <w:szCs w:val="20"/>
           <w:lang w:eastAsia="en-US"/>
         </w:rPr>
-        <w:t>userService</w:t>
+        <w:t>customerAPI</w:t>
       </w:r>
       <w:proofErr w:type="spellEnd"/>
       <w:r>
@@ -7507,12 +7507,12 @@
           <w:rFonts w:ascii="Consolas" w:hAnsi="Consolas" w:cs="Consolas"/>
           <w:b/>
           <w:bCs/>
-          <w:color w:val="000000"/>
-          <w:sz w:val="20"/>
-          <w:szCs w:val="20"/>
-          <w:lang w:eastAsia="en-US"/>
-        </w:rPr>
-        <w:t>UserService</w:t>
+          <w:color w:val="2B91AF"/>
+          <w:sz w:val="20"/>
+          <w:szCs w:val="20"/>
+          <w:lang w:eastAsia="en-US"/>
+        </w:rPr>
+        <w:t>CustomerApiIntegration</w:t>
       </w:r>
       <w:proofErr w:type="spellEnd"/>
       <w:r>
@@ -7568,7 +7568,19 @@
           <w:szCs w:val="20"/>
           <w:lang w:eastAsia="en-US"/>
         </w:rPr>
-        <w:t>userService.getCustomerByID</w:t>
+        <w:t>customerAPI</w:t>
+      </w:r>
+      <w:r>
+        <w:rPr>
+          <w:rFonts w:ascii="Consolas" w:hAnsi="Consolas" w:cs="Consolas"/>
+          <w:b/>
+          <w:bCs/>
+          <w:color w:val="000000"/>
+          <w:sz w:val="20"/>
+          <w:szCs w:val="20"/>
+          <w:lang w:eastAsia="en-US"/>
+        </w:rPr>
+        <w:t>.getCustomerByID</w:t>
       </w:r>
       <w:proofErr w:type="spellEnd"/>
       <w:r>
@@ -7963,12 +7975,12 @@
           <w:rFonts w:ascii="Consolas" w:hAnsi="Consolas" w:cs="Consolas"/>
           <w:b/>
           <w:bCs/>
-          <w:color w:val="000000"/>
-          <w:sz w:val="20"/>
-          <w:szCs w:val="20"/>
-          <w:lang w:eastAsia="en-US"/>
-        </w:rPr>
-        <w:t>UserService</w:t>
+          <w:color w:val="2B91AF"/>
+          <w:sz w:val="20"/>
+          <w:szCs w:val="20"/>
+          <w:lang w:eastAsia="en-US"/>
+        </w:rPr>
+        <w:t>CustomerApiIntegration</w:t>
       </w:r>
       <w:proofErr w:type="spellEnd"/>
       <w:r>
@@ -7976,7 +7988,7 @@
           <w:rFonts w:ascii="Consolas" w:hAnsi="Consolas" w:cs="Consolas"/>
           <w:b/>
           <w:bCs/>
-          <w:color w:val="000000"/>
+          <w:color w:val="2B91AF"/>
           <w:sz w:val="20"/>
           <w:szCs w:val="20"/>
           <w:lang w:eastAsia="en-US"/>
@@ -7994,7 +8006,7 @@
           <w:szCs w:val="20"/>
           <w:lang w:eastAsia="en-US"/>
         </w:rPr>
-        <w:t>userService</w:t>
+        <w:t>customerAPI</w:t>
       </w:r>
       <w:proofErr w:type="spellEnd"/>
       <w:r>
@@ -8039,12 +8051,12 @@
           <w:rFonts w:ascii="Consolas" w:hAnsi="Consolas" w:cs="Consolas"/>
           <w:b/>
           <w:bCs/>
-          <w:color w:val="000000"/>
-          <w:sz w:val="20"/>
-          <w:szCs w:val="20"/>
-          <w:lang w:eastAsia="en-US"/>
-        </w:rPr>
-        <w:t>UserService</w:t>
+          <w:color w:val="2B91AF"/>
+          <w:sz w:val="20"/>
+          <w:szCs w:val="20"/>
+          <w:lang w:eastAsia="en-US"/>
+        </w:rPr>
+        <w:t>CustomerApiIntegration</w:t>
       </w:r>
       <w:proofErr w:type="spellEnd"/>
       <w:r>
@@ -8100,7 +8112,19 @@
           <w:szCs w:val="20"/>
           <w:lang w:eastAsia="en-US"/>
         </w:rPr>
-        <w:t>userService.getCustomers</w:t>
+        <w:t>customerAPI</w:t>
+      </w:r>
+      <w:r>
+        <w:rPr>
+          <w:rFonts w:ascii="Consolas" w:hAnsi="Consolas" w:cs="Consolas"/>
+          <w:b/>
+          <w:bCs/>
+          <w:color w:val="000000"/>
+          <w:sz w:val="20"/>
+          <w:szCs w:val="20"/>
+          <w:lang w:eastAsia="en-US"/>
+        </w:rPr>
+        <w:t>.getCustomers</w:t>
       </w:r>
       <w:proofErr w:type="spellEnd"/>
       <w:r>

</xml_diff>